<commit_message>
Regulate state diagrams and we create the ERD diagram
</commit_message>
<xml_diff>
--- a/Activity&StateDiagrams/Activity and state Diagrams _ sibora.docx
+++ b/Activity&StateDiagrams/Activity and state Diagrams _ sibora.docx
@@ -9,6 +9,20 @@
           <w:bCs/>
         </w:rPr>
       </w:pPr>
+      <w:r>
+        <w:rPr>
+          <w:b/>
+          <w:bCs/>
+        </w:rPr>
+        <w:t>UC_LMS_</w:t>
+      </w:r>
+      <w:r>
+        <w:rPr>
+          <w:b/>
+          <w:bCs/>
+        </w:rPr>
+        <w:t xml:space="preserve">21 </w:t>
+      </w:r>
       <w:r>
         <w:rPr>
           <w:b/>
@@ -142,64 +156,32 @@
           <w:bCs/>
         </w:rPr>
         <w:lastRenderedPageBreak/>
-        <w:t>State Diagram</w:t>
-      </w:r>
-    </w:p>
-    <w:p>
-      <w:pPr>
-        <w:rPr>
-          <w:b/>
-          <w:bCs/>
-        </w:rPr>
-      </w:pPr>
-    </w:p>
-    <w:p>
-      <w:pPr>
-        <w:rPr>
-          <w:b/>
-          <w:bCs/>
-        </w:rPr>
-      </w:pPr>
-      <w:r>
-        <w:rPr>
-          <w:b/>
-          <w:bCs/>
-        </w:rPr>
-        <w:drawing>
-          <wp:inline distT="0" distB="0" distL="0" distR="0" wp14:anchorId="09EC3674" wp14:editId="45F1B5B7">
-            <wp:extent cx="5353797" cy="7297168"/>
-            <wp:effectExtent l="0" t="0" r="0" b="0"/>
-            <wp:docPr id="1108366927" name="Picture 1"/>
-            <wp:cNvGraphicFramePr>
-              <a:graphicFrameLocks xmlns:a="http://schemas.openxmlformats.org/drawingml/2006/main" noChangeAspect="1"/>
-            </wp:cNvGraphicFramePr>
-            <a:graphic xmlns:a="http://schemas.openxmlformats.org/drawingml/2006/main">
-              <a:graphicData uri="http://schemas.openxmlformats.org/drawingml/2006/picture">
-                <pic:pic xmlns:pic="http://schemas.openxmlformats.org/drawingml/2006/picture">
-                  <pic:nvPicPr>
-                    <pic:cNvPr id="1108366927" name=""/>
-                    <pic:cNvPicPr/>
-                  </pic:nvPicPr>
-                  <pic:blipFill>
-                    <a:blip r:embed="rId5"/>
-                    <a:stretch>
-                      <a:fillRect/>
-                    </a:stretch>
-                  </pic:blipFill>
-                  <pic:spPr>
-                    <a:xfrm>
-                      <a:off x="0" y="0"/>
-                      <a:ext cx="5353797" cy="7297168"/>
-                    </a:xfrm>
-                    <a:prstGeom prst="rect">
-                      <a:avLst/>
-                    </a:prstGeom>
-                  </pic:spPr>
-                </pic:pic>
-              </a:graphicData>
-            </a:graphic>
-          </wp:inline>
-        </w:drawing>
+        <w:t xml:space="preserve"> </w:t>
+      </w:r>
+    </w:p>
+    <w:p>
+      <w:pPr>
+        <w:rPr>
+          <w:b/>
+          <w:bCs/>
+        </w:rPr>
+      </w:pPr>
+      <w:r>
+        <w:rPr>
+          <w:b/>
+          <w:bCs/>
+        </w:rPr>
+        <w:t>UC_LMS_</w:t>
+      </w:r>
+      <w:r>
+        <w:rPr>
+          <w:b/>
+          <w:bCs/>
+        </w:rPr>
+        <w:t xml:space="preserve">22 </w:t>
+      </w:r>
+      <w:r>
+        <w:t>Return Library Material</w:t>
       </w:r>
     </w:p>
     <w:p>
@@ -213,7 +195,6 @@
         <w:rPr>
           <w:noProof/>
         </w:rPr>
-        <w:lastRenderedPageBreak/>
         <w:t xml:space="preserve"> </w:t>
       </w:r>
       <w:r>
@@ -236,7 +217,7 @@
                     <pic:cNvPicPr/>
                   </pic:nvPicPr>
                   <pic:blipFill>
-                    <a:blip r:embed="rId6">
+                    <a:blip r:embed="rId5">
                       <a:extLst>
                         <a:ext uri="{28A0092B-C50C-407E-A947-70E740481C1C}">
                           <a14:useLocalDpi xmlns:a14="http://schemas.microsoft.com/office/drawing/2010/main" val="0"/>
@@ -284,7 +265,7 @@
                     <pic:cNvPicPr/>
                   </pic:nvPicPr>
                   <pic:blipFill>
-                    <a:blip r:embed="rId7">
+                    <a:blip r:embed="rId6">
                       <a:extLst>
                         <a:ext uri="{28A0092B-C50C-407E-A947-70E740481C1C}">
                           <a14:useLocalDpi xmlns:a14="http://schemas.microsoft.com/office/drawing/2010/main" val="0"/>
@@ -312,29 +293,79 @@
       </w:r>
     </w:p>
     <w:p/>
-    <w:p>
-      <w:r>
-        <w:t>Return Library Material</w:t>
-      </w:r>
-    </w:p>
     <w:p/>
     <w:p/>
-    <w:p/>
-    <w:p/>
-    <w:p/>
-    <w:p>
-      <w:r>
+    <w:p>
+      <w:pPr>
+        <w:rPr>
+          <w:b/>
+          <w:bCs/>
+        </w:rPr>
+      </w:pPr>
+    </w:p>
+    <w:p>
+      <w:pPr>
+        <w:rPr>
+          <w:b/>
+          <w:bCs/>
+        </w:rPr>
+      </w:pPr>
+    </w:p>
+    <w:p>
+      <w:pPr>
+        <w:rPr>
+          <w:b/>
+          <w:bCs/>
+        </w:rPr>
+      </w:pPr>
+      <w:r>
+        <w:rPr>
+          <w:b/>
+          <w:bCs/>
+        </w:rPr>
         <w:lastRenderedPageBreak/>
-        <w:t>State Diagram</w:t>
-      </w:r>
-    </w:p>
-    <w:p>
-      <w:r>
+        <w:t>UC_LMS_</w:t>
+      </w:r>
+      <w:r>
+        <w:rPr>
+          <w:b/>
+          <w:bCs/>
+        </w:rPr>
+        <w:t>23</w:t>
+      </w:r>
+      <w:r>
+        <w:rPr>
+          <w:b/>
+          <w:bCs/>
+        </w:rPr>
+        <w:t xml:space="preserve"> </w:t>
+      </w:r>
+      <w:r>
+        <w:rPr>
+          <w:b/>
+          <w:bCs/>
+        </w:rPr>
+        <w:t>Renew Borrowed Material</w:t>
+      </w:r>
+    </w:p>
+    <w:p>
+      <w:pPr>
+        <w:rPr>
+          <w:b/>
+          <w:bCs/>
+        </w:rPr>
+      </w:pPr>
+    </w:p>
+    <w:p>
+      <w:r>
+        <w:rPr>
+          <w:noProof/>
+        </w:rPr>
         <w:drawing>
-          <wp:inline distT="0" distB="0" distL="0" distR="0" wp14:anchorId="490CEF90" wp14:editId="104F3431">
-            <wp:extent cx="4696480" cy="7363853"/>
-            <wp:effectExtent l="0" t="0" r="8890" b="8890"/>
-            <wp:docPr id="636388797" name="Picture 1"/>
+          <wp:inline distT="0" distB="0" distL="0" distR="0" wp14:anchorId="7FCC58F5" wp14:editId="5A86BB5B">
+            <wp:extent cx="5943600" cy="5567045"/>
+            <wp:effectExtent l="0" t="0" r="0" b="0"/>
+            <wp:docPr id="1158501024" name="Picture 1"/>
             <wp:cNvGraphicFramePr>
               <a:graphicFrameLocks xmlns:a="http://schemas.openxmlformats.org/drawingml/2006/main" noChangeAspect="1"/>
             </wp:cNvGraphicFramePr>
@@ -342,11 +373,11 @@
               <a:graphicData uri="http://schemas.openxmlformats.org/drawingml/2006/picture">
                 <pic:pic xmlns:pic="http://schemas.openxmlformats.org/drawingml/2006/picture">
                   <pic:nvPicPr>
-                    <pic:cNvPr id="636388797" name=""/>
+                    <pic:cNvPr id="1158501024" name=""/>
                     <pic:cNvPicPr/>
                   </pic:nvPicPr>
                   <pic:blipFill>
-                    <a:blip r:embed="rId8"/>
+                    <a:blip r:embed="rId7"/>
                     <a:stretch>
                       <a:fillRect/>
                     </a:stretch>
@@ -354,7 +385,7 @@
                   <pic:spPr>
                     <a:xfrm>
                       <a:off x="0" y="0"/>
-                      <a:ext cx="4696480" cy="7363853"/>
+                      <a:ext cx="5943600" cy="5567045"/>
                     </a:xfrm>
                     <a:prstGeom prst="rect">
                       <a:avLst/>
@@ -368,29 +399,53 @@
       </w:r>
     </w:p>
     <w:p/>
-    <w:p>
-      <w:pPr>
-        <w:rPr>
-          <w:b/>
-          <w:bCs/>
-        </w:rPr>
-      </w:pPr>
-      <w:r>
-        <w:rPr>
-          <w:b/>
-          <w:bCs/>
-        </w:rPr>
-        <w:lastRenderedPageBreak/>
-        <w:t>Renew Borrowed Material</w:t>
-      </w:r>
-    </w:p>
-    <w:p>
-      <w:r>
+    <w:p/>
+    <w:p/>
+    <w:p/>
+    <w:p/>
+    <w:p/>
+    <w:p/>
+    <w:p/>
+    <w:p/>
+    <w:p>
+      <w:pPr>
+        <w:rPr>
+          <w:b/>
+          <w:bCs/>
+        </w:rPr>
+      </w:pPr>
+      <w:r>
+        <w:rPr>
+          <w:b/>
+          <w:bCs/>
+        </w:rPr>
+        <w:t>UC_LMS_</w:t>
+      </w:r>
+      <w:r>
+        <w:rPr>
+          <w:b/>
+          <w:bCs/>
+        </w:rPr>
+        <w:t xml:space="preserve">24 </w:t>
+      </w:r>
+      <w:r>
+        <w:rPr>
+          <w:b/>
+          <w:bCs/>
+        </w:rPr>
+        <w:t>View User Borrowing History and Current Loans</w:t>
+      </w:r>
+    </w:p>
+    <w:p>
+      <w:r>
+        <w:rPr>
+          <w:noProof/>
+        </w:rPr>
         <w:drawing>
-          <wp:inline distT="0" distB="0" distL="0" distR="0" wp14:anchorId="1E50ED20" wp14:editId="274964D4">
-            <wp:extent cx="5943600" cy="6600825"/>
-            <wp:effectExtent l="0" t="0" r="0" b="9525"/>
-            <wp:docPr id="505314052" name="Picture 1"/>
+          <wp:inline distT="0" distB="0" distL="0" distR="0" wp14:anchorId="14C8E28A" wp14:editId="04A54673">
+            <wp:extent cx="5943600" cy="4307840"/>
+            <wp:effectExtent l="0" t="1270" r="0" b="0"/>
+            <wp:docPr id="1200628775" name="Picture 1"/>
             <wp:cNvGraphicFramePr>
               <a:graphicFrameLocks xmlns:a="http://schemas.openxmlformats.org/drawingml/2006/main" noChangeAspect="1"/>
             </wp:cNvGraphicFramePr>
@@ -398,19 +453,25 @@
               <a:graphicData uri="http://schemas.openxmlformats.org/drawingml/2006/picture">
                 <pic:pic xmlns:pic="http://schemas.openxmlformats.org/drawingml/2006/picture">
                   <pic:nvPicPr>
-                    <pic:cNvPr id="505314052" name=""/>
+                    <pic:cNvPr id="1200628775" name="Picture 1200628775"/>
                     <pic:cNvPicPr/>
                   </pic:nvPicPr>
                   <pic:blipFill>
-                    <a:blip r:embed="rId9"/>
+                    <a:blip r:embed="rId8" cstate="print">
+                      <a:extLst>
+                        <a:ext uri="{28A0092B-C50C-407E-A947-70E740481C1C}">
+                          <a14:useLocalDpi xmlns:a14="http://schemas.microsoft.com/office/drawing/2010/main" val="0"/>
+                        </a:ext>
+                      </a:extLst>
+                    </a:blip>
                     <a:stretch>
                       <a:fillRect/>
                     </a:stretch>
                   </pic:blipFill>
                   <pic:spPr>
-                    <a:xfrm>
+                    <a:xfrm rot="16200000">
                       <a:off x="0" y="0"/>
-                      <a:ext cx="5943600" cy="6600825"/>
+                      <a:ext cx="5943600" cy="4307840"/>
                     </a:xfrm>
                     <a:prstGeom prst="rect">
                       <a:avLst/>
@@ -423,167 +484,30 @@
         </w:drawing>
       </w:r>
     </w:p>
-    <w:p>
-      <w:r>
-        <w:lastRenderedPageBreak/>
-        <w:drawing>
-          <wp:inline distT="0" distB="0" distL="0" distR="0" wp14:anchorId="3020570C" wp14:editId="63B83BF4">
-            <wp:extent cx="2114845" cy="7363853"/>
-            <wp:effectExtent l="0" t="0" r="0" b="8890"/>
-            <wp:docPr id="1100336002" name="Picture 1"/>
-            <wp:cNvGraphicFramePr>
-              <a:graphicFrameLocks xmlns:a="http://schemas.openxmlformats.org/drawingml/2006/main" noChangeAspect="1"/>
-            </wp:cNvGraphicFramePr>
-            <a:graphic xmlns:a="http://schemas.openxmlformats.org/drawingml/2006/main">
-              <a:graphicData uri="http://schemas.openxmlformats.org/drawingml/2006/picture">
-                <pic:pic xmlns:pic="http://schemas.openxmlformats.org/drawingml/2006/picture">
-                  <pic:nvPicPr>
-                    <pic:cNvPr id="1100336002" name=""/>
-                    <pic:cNvPicPr/>
-                  </pic:nvPicPr>
-                  <pic:blipFill>
-                    <a:blip r:embed="rId10"/>
-                    <a:stretch>
-                      <a:fillRect/>
-                    </a:stretch>
-                  </pic:blipFill>
-                  <pic:spPr>
-                    <a:xfrm>
-                      <a:off x="0" y="0"/>
-                      <a:ext cx="2114845" cy="7363853"/>
-                    </a:xfrm>
-                    <a:prstGeom prst="rect">
-                      <a:avLst/>
-                    </a:prstGeom>
-                  </pic:spPr>
-                </pic:pic>
-              </a:graphicData>
-            </a:graphic>
-          </wp:inline>
-        </w:drawing>
-      </w:r>
-    </w:p>
-    <w:p/>
-    <w:p/>
-    <w:p>
-      <w:pPr>
-        <w:rPr>
-          <w:b/>
-          <w:bCs/>
-        </w:rPr>
-      </w:pPr>
-      <w:r>
-        <w:rPr>
-          <w:b/>
-          <w:bCs/>
-        </w:rPr>
-        <w:lastRenderedPageBreak/>
-        <w:t>View User Borrowing History and Current Loans</w:t>
-      </w:r>
-    </w:p>
-    <w:p>
-      <w:r>
-        <w:drawing>
-          <wp:inline distT="0" distB="0" distL="0" distR="0" wp14:anchorId="42DB9C91" wp14:editId="7E122CA8">
-            <wp:extent cx="2981741" cy="7478169"/>
-            <wp:effectExtent l="0" t="0" r="9525" b="8890"/>
-            <wp:docPr id="1958612596" name="Picture 1"/>
-            <wp:cNvGraphicFramePr>
-              <a:graphicFrameLocks xmlns:a="http://schemas.openxmlformats.org/drawingml/2006/main" noChangeAspect="1"/>
-            </wp:cNvGraphicFramePr>
-            <a:graphic xmlns:a="http://schemas.openxmlformats.org/drawingml/2006/main">
-              <a:graphicData uri="http://schemas.openxmlformats.org/drawingml/2006/picture">
-                <pic:pic xmlns:pic="http://schemas.openxmlformats.org/drawingml/2006/picture">
-                  <pic:nvPicPr>
-                    <pic:cNvPr id="1958612596" name=""/>
-                    <pic:cNvPicPr/>
-                  </pic:nvPicPr>
-                  <pic:blipFill>
-                    <a:blip r:embed="rId11"/>
-                    <a:stretch>
-                      <a:fillRect/>
-                    </a:stretch>
-                  </pic:blipFill>
-                  <pic:spPr>
-                    <a:xfrm>
-                      <a:off x="0" y="0"/>
-                      <a:ext cx="2981741" cy="7478169"/>
-                    </a:xfrm>
-                    <a:prstGeom prst="rect">
-                      <a:avLst/>
-                    </a:prstGeom>
-                  </pic:spPr>
-                </pic:pic>
-              </a:graphicData>
-            </a:graphic>
-          </wp:inline>
-        </w:drawing>
-      </w:r>
-    </w:p>
-    <w:p>
-      <w:r>
-        <w:lastRenderedPageBreak/>
-        <w:drawing>
-          <wp:inline distT="0" distB="0" distL="0" distR="0" wp14:anchorId="233D034A" wp14:editId="2BD12739">
-            <wp:extent cx="5943600" cy="6786245"/>
-            <wp:effectExtent l="0" t="0" r="0" b="0"/>
-            <wp:docPr id="456239047" name="Picture 1"/>
-            <wp:cNvGraphicFramePr>
-              <a:graphicFrameLocks xmlns:a="http://schemas.openxmlformats.org/drawingml/2006/main" noChangeAspect="1"/>
-            </wp:cNvGraphicFramePr>
-            <a:graphic xmlns:a="http://schemas.openxmlformats.org/drawingml/2006/main">
-              <a:graphicData uri="http://schemas.openxmlformats.org/drawingml/2006/picture">
-                <pic:pic xmlns:pic="http://schemas.openxmlformats.org/drawingml/2006/picture">
-                  <pic:nvPicPr>
-                    <pic:cNvPr id="456239047" name=""/>
-                    <pic:cNvPicPr/>
-                  </pic:nvPicPr>
-                  <pic:blipFill>
-                    <a:blip r:embed="rId12"/>
-                    <a:stretch>
-                      <a:fillRect/>
-                    </a:stretch>
-                  </pic:blipFill>
-                  <pic:spPr>
-                    <a:xfrm>
-                      <a:off x="0" y="0"/>
-                      <a:ext cx="5943600" cy="6786245"/>
-                    </a:xfrm>
-                    <a:prstGeom prst="rect">
-                      <a:avLst/>
-                    </a:prstGeom>
-                  </pic:spPr>
-                </pic:pic>
-              </a:graphicData>
-            </a:graphic>
-          </wp:inline>
-        </w:drawing>
-      </w:r>
-    </w:p>
     <w:p/>
     <w:p/>
     <w:p/>
     <w:p>
-      <w:pPr>
-        <w:rPr>
-          <w:b/>
-          <w:bCs/>
-        </w:rPr>
-      </w:pPr>
-    </w:p>
-    <w:p>
-      <w:pPr>
-        <w:rPr>
-          <w:b/>
-          <w:bCs/>
-        </w:rPr>
-      </w:pPr>
       <w:r>
         <w:rPr>
           <w:b/>
           <w:bCs/>
         </w:rPr>
         <w:lastRenderedPageBreak/>
+        <w:t>UC_LMS_</w:t>
+      </w:r>
+      <w:r>
+        <w:rPr>
+          <w:b/>
+          <w:bCs/>
+        </w:rPr>
+        <w:t xml:space="preserve">25 </w:t>
+      </w:r>
+      <w:r>
+        <w:rPr>
+          <w:b/>
+          <w:bCs/>
+        </w:rPr>
         <w:t>Place and Manage Reservations</w:t>
       </w:r>
     </w:p>
@@ -608,7 +532,7 @@
                     <pic:cNvPicPr/>
                   </pic:nvPicPr>
                   <pic:blipFill>
-                    <a:blip r:embed="rId13" cstate="print">
+                    <a:blip r:embed="rId9" cstate="print">
                       <a:extLst>
                         <a:ext uri="{28A0092B-C50C-407E-A947-70E740481C1C}">
                           <a14:useLocalDpi xmlns:a14="http://schemas.microsoft.com/office/drawing/2010/main" val="0"/>
@@ -635,46 +559,6 @@
         </w:drawing>
       </w:r>
     </w:p>
-    <w:p>
-      <w:r>
-        <w:lastRenderedPageBreak/>
-        <w:drawing>
-          <wp:inline distT="0" distB="0" distL="0" distR="0" wp14:anchorId="0F177CEC" wp14:editId="132018A4">
-            <wp:extent cx="3810532" cy="7411484"/>
-            <wp:effectExtent l="0" t="0" r="0" b="0"/>
-            <wp:docPr id="131815317" name="Picture 1"/>
-            <wp:cNvGraphicFramePr>
-              <a:graphicFrameLocks xmlns:a="http://schemas.openxmlformats.org/drawingml/2006/main" noChangeAspect="1"/>
-            </wp:cNvGraphicFramePr>
-            <a:graphic xmlns:a="http://schemas.openxmlformats.org/drawingml/2006/main">
-              <a:graphicData uri="http://schemas.openxmlformats.org/drawingml/2006/picture">
-                <pic:pic xmlns:pic="http://schemas.openxmlformats.org/drawingml/2006/picture">
-                  <pic:nvPicPr>
-                    <pic:cNvPr id="131815317" name=""/>
-                    <pic:cNvPicPr/>
-                  </pic:nvPicPr>
-                  <pic:blipFill>
-                    <a:blip r:embed="rId14"/>
-                    <a:stretch>
-                      <a:fillRect/>
-                    </a:stretch>
-                  </pic:blipFill>
-                  <pic:spPr>
-                    <a:xfrm>
-                      <a:off x="0" y="0"/>
-                      <a:ext cx="3810532" cy="7411484"/>
-                    </a:xfrm>
-                    <a:prstGeom prst="rect">
-                      <a:avLst/>
-                    </a:prstGeom>
-                  </pic:spPr>
-                </pic:pic>
-              </a:graphicData>
-            </a:graphic>
-          </wp:inline>
-        </w:drawing>
-      </w:r>
-    </w:p>
     <w:p/>
     <w:p/>
     <w:p>
@@ -689,7 +573,20 @@
           <w:b/>
           <w:bCs/>
         </w:rPr>
-        <w:lastRenderedPageBreak/>
+        <w:t>UC_LMS_</w:t>
+      </w:r>
+      <w:r>
+        <w:rPr>
+          <w:b/>
+          <w:bCs/>
+        </w:rPr>
+        <w:t xml:space="preserve">26 </w:t>
+      </w:r>
+      <w:r>
+        <w:rPr>
+          <w:b/>
+          <w:bCs/>
+        </w:rPr>
         <w:t>Calculate and Manage Overdue Fines</w:t>
       </w:r>
     </w:p>
@@ -722,7 +619,7 @@
                     <pic:cNvPicPr/>
                   </pic:nvPicPr>
                   <pic:blipFill>
-                    <a:blip r:embed="rId15">
+                    <a:blip r:embed="rId10">
                       <a:extLst>
                         <a:ext uri="{28A0092B-C50C-407E-A947-70E740481C1C}">
                           <a14:useLocalDpi xmlns:a14="http://schemas.microsoft.com/office/drawing/2010/main" val="0"/>
@@ -750,13 +647,55 @@
       </w:r>
     </w:p>
     <w:p>
-      <w:r>
+      <w:pPr>
+        <w:rPr>
+          <w:b/>
+          <w:bCs/>
+        </w:rPr>
+      </w:pPr>
+    </w:p>
+    <w:p>
+      <w:pPr>
+        <w:rPr>
+          <w:b/>
+          <w:bCs/>
+        </w:rPr>
+      </w:pPr>
+    </w:p>
+    <w:p>
+      <w:pPr>
+        <w:rPr>
+          <w:b/>
+          <w:bCs/>
+        </w:rPr>
+      </w:pPr>
+      <w:r>
+        <w:rPr>
+          <w:b/>
+          <w:bCs/>
+        </w:rPr>
         <w:lastRenderedPageBreak/>
+        <w:t>Finance State Diagram</w:t>
+      </w:r>
+    </w:p>
+    <w:p>
+      <w:pPr>
+        <w:rPr>
+          <w:b/>
+          <w:bCs/>
+        </w:rPr>
+      </w:pPr>
+      <w:r>
+        <w:rPr>
+          <w:b/>
+          <w:bCs/>
+          <w:noProof/>
+        </w:rPr>
         <w:drawing>
-          <wp:inline distT="0" distB="0" distL="0" distR="0" wp14:anchorId="1251106E" wp14:editId="4AF017CA">
-            <wp:extent cx="5163271" cy="7411484"/>
-            <wp:effectExtent l="0" t="0" r="0" b="0"/>
-            <wp:docPr id="1308238854" name="Picture 1"/>
+          <wp:inline distT="0" distB="0" distL="0" distR="0" wp14:anchorId="37E41DE1" wp14:editId="6293C858">
+            <wp:extent cx="4311650" cy="7708222"/>
+            <wp:effectExtent l="0" t="0" r="0" b="7620"/>
+            <wp:docPr id="1581104610" name="Picture 2"/>
             <wp:cNvGraphicFramePr>
               <a:graphicFrameLocks xmlns:a="http://schemas.openxmlformats.org/drawingml/2006/main" noChangeAspect="1"/>
             </wp:cNvGraphicFramePr>
@@ -764,11 +703,17 @@
               <a:graphicData uri="http://schemas.openxmlformats.org/drawingml/2006/picture">
                 <pic:pic xmlns:pic="http://schemas.openxmlformats.org/drawingml/2006/picture">
                   <pic:nvPicPr>
-                    <pic:cNvPr id="1308238854" name=""/>
+                    <pic:cNvPr id="1581104610" name="Picture 1581104610"/>
                     <pic:cNvPicPr/>
                   </pic:nvPicPr>
                   <pic:blipFill>
-                    <a:blip r:embed="rId16"/>
+                    <a:blip r:embed="rId11">
+                      <a:extLst>
+                        <a:ext uri="{28A0092B-C50C-407E-A947-70E740481C1C}">
+                          <a14:useLocalDpi xmlns:a14="http://schemas.microsoft.com/office/drawing/2010/main" val="0"/>
+                        </a:ext>
+                      </a:extLst>
+                    </a:blip>
                     <a:stretch>
                       <a:fillRect/>
                     </a:stretch>
@@ -776,7 +721,7 @@
                   <pic:spPr>
                     <a:xfrm>
                       <a:off x="0" y="0"/>
-                      <a:ext cx="5163271" cy="7411484"/>
+                      <a:ext cx="4343186" cy="7764600"/>
                     </a:xfrm>
                     <a:prstGeom prst="rect">
                       <a:avLst/>

</xml_diff>